<commit_message>
Sync manuscript commit reference
</commit_message>
<xml_diff>
--- a/manuscript/SnowLotus_CellFM_中文论文稿_模型功能优势详版_v0_6.docx
+++ b/manuscript/SnowLotus_CellFM_中文论文稿_模型功能优势详版_v0_6.docx
@@ -39,7 +39,7 @@
           <w:b w:val="0"/>
           <w:sz w:val="19"/>
         </w:rPr>
-        <w:t>生成时间：2026-07-27 03:19 Asia/Shanghai</w:t>
+        <w:t>生成时间：2026-07-27 03:28 Asia/Shanghai</w:t>
       </w:r>
     </w:p>
     <w:p>
@@ -102,7 +102,7 @@
           <w:b w:val="0"/>
           <w:sz w:val="21"/>
         </w:rPr>
-        <w:t>ce065cc31e521879461de862b3e7c1add8bd31b7</w:t>
+        <w:t>b7ea6dd18cfe739efb0c6e640c4065cc5942de4d</w:t>
       </w:r>
     </w:p>
     <w:p>
@@ -1304,7 +1304,7 @@
           <w:b w:val="0"/>
           <w:sz w:val="21"/>
         </w:rPr>
-        <w:t>当前版本已经完成代码仓库与提交包整理。代码地址为 GitHub 仓库：https://github.com/ahvsjags/SnowLotus-CellFM。Release tag 为：https://github.com/ahvsjags/SnowLotus-CellFM/releases/tag/editor-v0.3。最新同步 commit 为：ce065cc31e521879461de862b3e7c1add8bd31b7。提交包文件为：SnowLotus-CellFM_editor-v0.3_submit-now.zip。仓库中包含 src、configs、scripts、tests、manuscript、release_metadata 和 models 等目录，覆盖模型训练、语料构建、预测导出、数据审计和编辑材料生成。</w:t>
+        <w:t>当前版本已经完成代码仓库与提交包整理。代码地址为 GitHub 仓库：https://github.com/ahvsjags/SnowLotus-CellFM。Release tag 为：https://github.com/ahvsjags/SnowLotus-CellFM/releases/tag/editor-v0.3。最新同步 commit 为：b7ea6dd18cfe739efb0c6e640c4065cc5942de4d。提交包文件为：SnowLotus-CellFM_editor-v0.3_submit-now.zip。仓库中包含 src、configs、scripts、tests、manuscript、release_metadata 和 models 等目录，覆盖模型训练、语料构建、预测导出、数据审计和编辑材料生成。</w:t>
       </w:r>
     </w:p>
     <w:p>
@@ -2351,7 +2351,7 @@
           <w:b w:val="0"/>
           <w:sz w:val="21"/>
         </w:rPr>
-        <w:t>ce065cc31e521879461de862b3e7c1add8bd31b7</w:t>
+        <w:t>b7ea6dd18cfe739efb0c6e640c4065cc5942de4d</w:t>
       </w:r>
     </w:p>
     <w:p>

</xml_diff>

<commit_message>
Use stable main-branch reference in editor manuscript
</commit_message>
<xml_diff>
--- a/manuscript/SnowLotus_CellFM_中文论文稿_模型功能优势详版_v0_6.docx
+++ b/manuscript/SnowLotus_CellFM_中文论文稿_模型功能优势详版_v0_6.docx
@@ -102,7 +102,7 @@
           <w:b w:val="0"/>
           <w:sz w:val="21"/>
         </w:rPr>
-        <w:t>b7ea6dd18cfe739efb0c6e640c4065cc5942de4d</w:t>
+        <w:t>main branch（latest synchronized source; inspect repository history）</w:t>
       </w:r>
     </w:p>
     <w:p>
@@ -1304,7 +1304,7 @@
           <w:b w:val="0"/>
           <w:sz w:val="21"/>
         </w:rPr>
-        <w:t>当前版本已经完成代码仓库与提交包整理。代码地址为 GitHub 仓库：https://github.com/ahvsjags/SnowLotus-CellFM。Release tag 为：https://github.com/ahvsjags/SnowLotus-CellFM/releases/tag/editor-v0.3。最新同步 commit 为：b7ea6dd18cfe739efb0c6e640c4065cc5942de4d。提交包文件为：SnowLotus-CellFM_editor-v0.3_submit-now.zip。仓库中包含 src、configs、scripts、tests、manuscript、release_metadata 和 models 等目录，覆盖模型训练、语料构建、预测导出、数据审计和编辑材料生成。</w:t>
+        <w:t>当前版本已经完成代码仓库与提交包整理。代码地址为 GitHub 仓库：https://github.com/ahvsjags/SnowLotus-CellFM。Release tag 为：https://github.com/ahvsjags/SnowLotus-CellFM/releases/tag/editor-v0.3。最新同步 commit 为：main branch（latest synchronized source; inspect repository history）。提交包文件为：SnowLotus-CellFM_editor-v0.3_submit-now.zip。仓库中包含 src、configs、scripts、tests、manuscript、release_metadata 和 models 等目录，覆盖模型训练、语料构建、预测导出、数据审计和编辑材料生成。</w:t>
       </w:r>
     </w:p>
     <w:p>
@@ -2351,7 +2351,7 @@
           <w:b w:val="0"/>
           <w:sz w:val="21"/>
         </w:rPr>
-        <w:t>b7ea6dd18cfe739efb0c6e640c4065cc5942de4d</w:t>
+        <w:t>main branch（latest synchronized source; inspect repository history）</w:t>
       </w:r>
     </w:p>
     <w:p>

</xml_diff>

<commit_message>
Remove stale commit wording from editor manuscript
</commit_message>
<xml_diff>
--- a/manuscript/SnowLotus_CellFM_中文论文稿_模型功能优势详版_v0_6.docx
+++ b/manuscript/SnowLotus_CellFM_中文论文稿_模型功能优势详版_v0_6.docx
@@ -39,7 +39,7 @@
           <w:b w:val="0"/>
           <w:sz w:val="19"/>
         </w:rPr>
-        <w:t>生成时间：2026-07-27 03:28 Asia/Shanghai</w:t>
+        <w:t>生成时间：2026-07-27 03:29 Asia/Shanghai</w:t>
       </w:r>
     </w:p>
     <w:p>
@@ -1346,7 +1346,7 @@
           <w:b w:val="0"/>
           <w:sz w:val="21"/>
         </w:rPr>
-        <w:t>工程交付方面，项目已经生成中文功能创新说明、中文论文稿、英文 manuscript draft、cover note、README、模型卡、数据卡、数据完整性审计、corpus provenance audit、benchmark gap audit、scPlantLLM 输入准备、scPlantAnnotate 授权 benchmark 输入包、提交状态页和一键 zip。最新主线 commit 为 `ce065cc31e521879461de862b3e7c1add8bd31b7`，编辑可以从 GitHub 链接进入代码，也可以直接打开 Word 稿和 zip 包核查模型功能、优势、真实数据训练记录和可复现材料。</w:t>
+        <w:t>工程交付方面，项目已经生成中文功能创新说明、中文论文稿、英文 manuscript draft、cover note、README、模型卡、数据卡、数据完整性审计、corpus provenance audit、benchmark gap audit、scPlantLLM 输入准备、scPlantAnnotate 授权 benchmark 输入包、提交状态页和一键 zip。GitHub `main` 分支持续同步最新源码，编辑可以从 GitHub 链接进入代码，也可以直接打开 Word 稿和 zip 包核查模型功能、优势、真实数据训练记录和可复现材料。</w:t>
       </w:r>
     </w:p>
     <w:p>

</xml_diff>